<commit_message>
Use student screenshots in practical work 2 report
</commit_message>
<xml_diff>
--- a/Отчет_ПР2_Есина_В.Д.docx
+++ b/Отчет_ПР2_Есина_В.Д.docx
@@ -1754,7 +1754,7 @@
           <w:b w:val="0"/>
           <w:sz w:val="22"/>
         </w:rPr>
-        <w:t>Рисунок 1 — успешное выполнение тестов pytest</w:t>
+        <w:t>Рисунок 1 — работа приложения: каталог и поиск скина</w:t>
       </w:r>
     </w:p>
     <w:p>
@@ -1764,7 +1764,7 @@
       <w:r>
         <w:drawing>
           <wp:inline xmlns:a="http://schemas.openxmlformats.org/drawingml/2006/main" xmlns:pic="http://schemas.openxmlformats.org/drawingml/2006/picture">
-            <wp:extent cx="5580000" cy="4478880"/>
+            <wp:extent cx="5580000" cy="5395806"/>
             <wp:docPr id="1468553569" name="Picture 1468553569"/>
             <wp:cNvGraphicFramePr>
               <a:graphicFrameLocks noChangeAspect="1"/>
@@ -1773,7 +1773,7 @@
               <a:graphicData uri="http://schemas.openxmlformats.org/drawingml/2006/picture">
                 <pic:pic>
                   <pic:nvPicPr>
-                    <pic:cNvPr id="0" name="pr2_pytest.png"/>
+                    <pic:cNvPr id="0" name="user_pr2_run.png"/>
                     <pic:cNvPicPr/>
                   </pic:nvPicPr>
                   <pic:blipFill>
@@ -1785,7 +1785,7 @@
                   <pic:spPr>
                     <a:xfrm>
                       <a:off x="0" y="0"/>
-                      <a:ext cx="5580000" cy="4478880"/>
+                      <a:ext cx="5580000" cy="5395806"/>
                     </a:xfrm>
                     <a:prstGeom prst="rect"/>
                   </pic:spPr>
@@ -1797,6 +1797,11 @@
       </w:r>
     </w:p>
     <w:p>
+      <w:r>
+        <w:br w:type="page"/>
+      </w:r>
+    </w:p>
+    <w:p>
       <w:pPr>
         <w:keepNext/>
         <w:spacing w:before="160"/>
@@ -1808,7 +1813,7 @@
           <w:b w:val="0"/>
           <w:sz w:val="22"/>
         </w:rPr>
-        <w:t>Рисунок 2 — проверка кода flake8</w:t>
+        <w:t>Рисунок 2 — результаты pytest, flake8 и история Git</w:t>
       </w:r>
     </w:p>
     <w:p>
@@ -1818,7 +1823,7 @@
       <w:r>
         <w:drawing>
           <wp:inline xmlns:a="http://schemas.openxmlformats.org/drawingml/2006/main" xmlns:pic="http://schemas.openxmlformats.org/drawingml/2006/picture">
-            <wp:extent cx="5580000" cy="788640"/>
+            <wp:extent cx="5760000" cy="2948928"/>
             <wp:docPr id="1468553570" name="Picture 1468553570"/>
             <wp:cNvGraphicFramePr>
               <a:graphicFrameLocks noChangeAspect="1"/>
@@ -1827,7 +1832,7 @@
               <a:graphicData uri="http://schemas.openxmlformats.org/drawingml/2006/picture">
                 <pic:pic>
                   <pic:nvPicPr>
-                    <pic:cNvPr id="0" name="pr2_flake8.png"/>
+                    <pic:cNvPr id="0" name="user_pr2_checks.png"/>
                     <pic:cNvPicPr/>
                   </pic:nvPicPr>
                   <pic:blipFill>
@@ -1839,61 +1844,7 @@
                   <pic:spPr>
                     <a:xfrm>
                       <a:off x="0" y="0"/>
-                      <a:ext cx="5580000" cy="788640"/>
-                    </a:xfrm>
-                    <a:prstGeom prst="rect"/>
-                  </pic:spPr>
-                </pic:pic>
-              </a:graphicData>
-            </a:graphic>
-          </wp:inline>
-        </w:drawing>
-      </w:r>
-    </w:p>
-    <w:p>
-      <w:pPr>
-        <w:keepNext/>
-        <w:spacing w:before="160"/>
-        <w:jc w:val="center"/>
-      </w:pPr>
-      <w:r>
-        <w:rPr>
-          <w:rFonts w:ascii="Times New Roman" w:hAnsi="Times New Roman" w:eastAsia="Times New Roman"/>
-          <w:b w:val="0"/>
-          <w:sz w:val="22"/>
-        </w:rPr>
-        <w:t>Рисунок 3 — работа консольного приложения</w:t>
-      </w:r>
-    </w:p>
-    <w:p>
-      <w:pPr>
-        <w:jc w:val="center"/>
-      </w:pPr>
-      <w:r>
-        <w:drawing>
-          <wp:inline xmlns:a="http://schemas.openxmlformats.org/drawingml/2006/main" xmlns:pic="http://schemas.openxmlformats.org/drawingml/2006/picture">
-            <wp:extent cx="5580000" cy="4478880"/>
-            <wp:docPr id="1468553571" name="Picture 1468553571"/>
-            <wp:cNvGraphicFramePr>
-              <a:graphicFrameLocks noChangeAspect="1"/>
-            </wp:cNvGraphicFramePr>
-            <a:graphic>
-              <a:graphicData uri="http://schemas.openxmlformats.org/drawingml/2006/picture">
-                <pic:pic>
-                  <pic:nvPicPr>
-                    <pic:cNvPr id="0" name="pr2_run.png"/>
-                    <pic:cNvPicPr/>
-                  </pic:nvPicPr>
-                  <pic:blipFill>
-                    <a:blip r:embed="rId11"/>
-                    <a:stretch>
-                      <a:fillRect/>
-                    </a:stretch>
-                  </pic:blipFill>
-                  <pic:spPr>
-                    <a:xfrm>
-                      <a:off x="0" y="0"/>
-                      <a:ext cx="5580000" cy="4478880"/>
+                      <a:ext cx="5760000" cy="2948928"/>
                     </a:xfrm>
                     <a:prstGeom prst="rect"/>
                   </pic:spPr>

</xml_diff>